<commit_message>
Update template report 1, 2 and 3.
</commit_message>
<xml_diff>
--- a/documents/templates/reference.docx
+++ b/documents/templates/reference.docx
@@ -2,14 +2,18 @@
 <file path=word/document.xml><?xml version="1.0" encoding="utf-8"?>
 <w:document xmlns:wpc="http://schemas.microsoft.com/office/word/2010/wordprocessingCanvas" xmlns:cx="http://schemas.microsoft.com/office/drawing/2014/chartex" xmlns:cx1="http://schemas.microsoft.com/office/drawing/2015/9/8/chartex" xmlns:cx2="http://schemas.microsoft.com/office/drawing/2015/10/21/chartex" xmlns:cx3="http://schemas.microsoft.com/office/drawing/2016/5/9/chartex" xmlns:cx4="http://schemas.microsoft.com/office/drawing/2016/5/10/chartex" xmlns:cx5="http://schemas.microsoft.com/office/drawing/2016/5/11/chartex" xmlns:cx6="http://schemas.microsoft.com/office/drawing/2016/5/12/chartex" xmlns:cx7="http://schemas.microsoft.com/office/drawing/2016/5/13/chartex" xmlns:cx8="http://schemas.microsoft.com/office/drawing/2016/5/14/chartex" xmlns:mc="http://schemas.openxmlformats.org/markup-compatibility/2006" xmlns:aink="http://schemas.microsoft.com/office/drawing/2016/ink" xmlns:am3d="http://schemas.microsoft.com/office/drawing/2017/model3d" xmlns:o="urn:schemas-microsoft-com:office:office" xmlns:r="http://schemas.openxmlformats.org/officeDocument/2006/relationships" xmlns:m="http://schemas.openxmlformats.org/officeDocument/2006/math" xmlns:v="urn:schemas-microsoft-com:vml" xmlns:wp14="http://schemas.microsoft.com/office/word/2010/wordprocessingDrawing" xmlns:wp="http://schemas.openxmlformats.org/drawingml/2006/wordprocessingDrawing" xmlns:w10="urn:schemas-microsoft-com:office:word" xmlns:w="http://schemas.openxmlformats.org/wordprocessingml/2006/main" xmlns:w14="http://schemas.microsoft.com/office/word/2010/wordml" xmlns:w15="http://schemas.microsoft.com/office/word/2012/wordml" xmlns:w16cex="http://schemas.microsoft.com/office/word/2018/wordml/cex" xmlns:w16cid="http://schemas.microsoft.com/office/word/2016/wordml/cid" xmlns:w16="http://schemas.microsoft.com/office/word/2018/wordml" xmlns:w16sdtdh="http://schemas.microsoft.com/office/word/2020/wordml/sdtdatahash" xmlns:w16se="http://schemas.microsoft.com/office/word/2015/wordml/symex" xmlns:wpg="http://schemas.microsoft.com/office/word/2010/wordprocessingGroup" xmlns:wpi="http://schemas.microsoft.com/office/word/2010/wordprocessingInk" xmlns:wne="http://schemas.microsoft.com/office/word/2006/wordml" xmlns:wps="http://schemas.microsoft.com/office/word/2010/wordprocessingShape" mc:Ignorable="w14 w15 w16se w16cid w16 w16cex w16sdtdh wp14">
   <w:body>
-    <w:p/>
+    <w:p>
+      <w:pPr>
+        <w:pStyle w:val="AbstractTitle"/>
+      </w:pPr>
+    </w:p>
     <w:sectPr>
-      <w:headerReference w:type="even" r:id="rId8"/>
-      <w:headerReference w:type="default" r:id="rId9"/>
-      <w:footerReference w:type="even" r:id="rId10"/>
-      <w:footerReference w:type="default" r:id="rId11"/>
-      <w:headerReference w:type="first" r:id="rId12"/>
-      <w:footerReference w:type="first" r:id="rId13"/>
+      <w:headerReference w:type="even" r:id="rId7"/>
+      <w:headerReference w:type="default" r:id="rId8"/>
+      <w:footerReference w:type="even" r:id="rId9"/>
+      <w:footerReference w:type="default" r:id="rId10"/>
+      <w:headerReference w:type="first" r:id="rId11"/>
+      <w:footerReference w:type="first" r:id="rId12"/>
       <w:footnotePr>
         <w:numRestart w:val="eachSect"/>
       </w:footnotePr>
@@ -87,30 +91,6 @@
       </w:r>
     </w:p>
   </w:footnote>
-  <w:footnote w:id="1">
-    <w:p>
-      <w:pPr>
-        <w:pStyle w:val="FootnoteText"/>
-      </w:pPr>
-      <w:r>
-        <w:rPr>
-          <w:rStyle w:val="FootnoteReference"/>
-        </w:rPr>
-        <w:footnoteRef/>
-      </w:r>
-      <w:r>
-        <w:t>Footnote Text.</w:t>
-      </w:r>
-    </w:p>
-    <w:p>
-      <w:pPr>
-        <w:pStyle w:val="FootnoteBlockText"/>
-      </w:pPr>
-      <w:r>
-        <w:t>Footnote Block Text</w:t>
-      </w:r>
-    </w:p>
-  </w:footnote>
 </w:footnotes>
 </file>
 
@@ -147,6 +127,191 @@
 <file path=word/numbering.xml><?xml version="1.0" encoding="utf-8"?>
 <w:numbering xmlns:wpc="http://schemas.microsoft.com/office/word/2010/wordprocessingCanvas" xmlns:cx="http://schemas.microsoft.com/office/drawing/2014/chartex" xmlns:cx1="http://schemas.microsoft.com/office/drawing/2015/9/8/chartex" xmlns:cx2="http://schemas.microsoft.com/office/drawing/2015/10/21/chartex" xmlns:cx3="http://schemas.microsoft.com/office/drawing/2016/5/9/chartex" xmlns:cx4="http://schemas.microsoft.com/office/drawing/2016/5/10/chartex" xmlns:cx5="http://schemas.microsoft.com/office/drawing/2016/5/11/chartex" xmlns:cx6="http://schemas.microsoft.com/office/drawing/2016/5/12/chartex" xmlns:cx7="http://schemas.microsoft.com/office/drawing/2016/5/13/chartex" xmlns:cx8="http://schemas.microsoft.com/office/drawing/2016/5/14/chartex" xmlns:mc="http://schemas.openxmlformats.org/markup-compatibility/2006" xmlns:aink="http://schemas.microsoft.com/office/drawing/2016/ink" xmlns:am3d="http://schemas.microsoft.com/office/drawing/2017/model3d" xmlns:o="urn:schemas-microsoft-com:office:office" xmlns:r="http://schemas.openxmlformats.org/officeDocument/2006/relationships" xmlns:m="http://schemas.openxmlformats.org/officeDocument/2006/math" xmlns:v="urn:schemas-microsoft-com:vml" xmlns:wp14="http://schemas.microsoft.com/office/word/2010/wordprocessingDrawing" xmlns:wp="http://schemas.openxmlformats.org/drawingml/2006/wordprocessingDrawing" xmlns:w10="urn:schemas-microsoft-com:office:word" xmlns:w="http://schemas.openxmlformats.org/wordprocessingml/2006/main" xmlns:w14="http://schemas.microsoft.com/office/word/2010/wordml" xmlns:w15="http://schemas.microsoft.com/office/word/2012/wordml" xmlns:w16cex="http://schemas.microsoft.com/office/word/2018/wordml/cex" xmlns:w16cid="http://schemas.microsoft.com/office/word/2016/wordml/cid" xmlns:w16="http://schemas.microsoft.com/office/word/2018/wordml" xmlns:w16sdtdh="http://schemas.microsoft.com/office/word/2020/wordml/sdtdatahash" xmlns:w16se="http://schemas.microsoft.com/office/word/2015/wordml/symex" xmlns:wpg="http://schemas.microsoft.com/office/word/2010/wordprocessingGroup" xmlns:wpi="http://schemas.microsoft.com/office/word/2010/wordprocessingInk" xmlns:wne="http://schemas.microsoft.com/office/word/2006/wordml" xmlns:wps="http://schemas.microsoft.com/office/word/2010/wordprocessingShape" mc:Ignorable="w14 w15 w16se w16cid w16 w16cex w16sdtdh wp14">
   <w:abstractNum w:abstractNumId="0" w15:restartNumberingAfterBreak="0">
+    <w:nsid w:val="FFFFFF7C"/>
+    <w:multiLevelType w:val="singleLevel"/>
+    <w:tmpl w:val="8F74ECDE"/>
+    <w:lvl w:ilvl="0">
+      <w:start w:val="1"/>
+      <w:numFmt w:val="decimal"/>
+      <w:lvlText w:val="%1."/>
+      <w:lvlJc w:val="left"/>
+      <w:pPr>
+        <w:tabs>
+          <w:tab w:val="num" w:pos="1800"/>
+        </w:tabs>
+        <w:ind w:left="1800" w:hanging="360"/>
+      </w:pPr>
+    </w:lvl>
+  </w:abstractNum>
+  <w:abstractNum w:abstractNumId="1" w15:restartNumberingAfterBreak="0">
+    <w:nsid w:val="FFFFFF7D"/>
+    <w:multiLevelType w:val="singleLevel"/>
+    <w:tmpl w:val="4EBC0798"/>
+    <w:lvl w:ilvl="0">
+      <w:start w:val="1"/>
+      <w:numFmt w:val="decimal"/>
+      <w:lvlText w:val="%1."/>
+      <w:lvlJc w:val="left"/>
+      <w:pPr>
+        <w:tabs>
+          <w:tab w:val="num" w:pos="1440"/>
+        </w:tabs>
+        <w:ind w:left="1440" w:hanging="360"/>
+      </w:pPr>
+    </w:lvl>
+  </w:abstractNum>
+  <w:abstractNum w:abstractNumId="2" w15:restartNumberingAfterBreak="0">
+    <w:nsid w:val="FFFFFF7E"/>
+    <w:multiLevelType w:val="singleLevel"/>
+    <w:tmpl w:val="83ACF026"/>
+    <w:lvl w:ilvl="0">
+      <w:start w:val="1"/>
+      <w:numFmt w:val="decimal"/>
+      <w:lvlText w:val="%1."/>
+      <w:lvlJc w:val="left"/>
+      <w:pPr>
+        <w:tabs>
+          <w:tab w:val="num" w:pos="1080"/>
+        </w:tabs>
+        <w:ind w:left="1080" w:hanging="360"/>
+      </w:pPr>
+    </w:lvl>
+  </w:abstractNum>
+  <w:abstractNum w:abstractNumId="3" w15:restartNumberingAfterBreak="0">
+    <w:nsid w:val="FFFFFF7F"/>
+    <w:multiLevelType w:val="singleLevel"/>
+    <w:tmpl w:val="7526D404"/>
+    <w:lvl w:ilvl="0">
+      <w:start w:val="1"/>
+      <w:numFmt w:val="decimal"/>
+      <w:lvlText w:val="%1."/>
+      <w:lvlJc w:val="left"/>
+      <w:pPr>
+        <w:tabs>
+          <w:tab w:val="num" w:pos="720"/>
+        </w:tabs>
+        <w:ind w:left="720" w:hanging="360"/>
+      </w:pPr>
+    </w:lvl>
+  </w:abstractNum>
+  <w:abstractNum w:abstractNumId="4" w15:restartNumberingAfterBreak="0">
+    <w:nsid w:val="FFFFFF80"/>
+    <w:multiLevelType w:val="singleLevel"/>
+    <w:tmpl w:val="832E23FC"/>
+    <w:lvl w:ilvl="0">
+      <w:start w:val="1"/>
+      <w:numFmt w:val="bullet"/>
+      <w:lvlText w:val=""/>
+      <w:lvlJc w:val="left"/>
+      <w:pPr>
+        <w:tabs>
+          <w:tab w:val="num" w:pos="1800"/>
+        </w:tabs>
+        <w:ind w:left="1800" w:hanging="360"/>
+      </w:pPr>
+      <w:rPr>
+        <w:rFonts w:ascii="Symbol" w:hAnsi="Symbol" w:hint="default"/>
+      </w:rPr>
+    </w:lvl>
+  </w:abstractNum>
+  <w:abstractNum w:abstractNumId="5" w15:restartNumberingAfterBreak="0">
+    <w:nsid w:val="FFFFFF81"/>
+    <w:multiLevelType w:val="singleLevel"/>
+    <w:tmpl w:val="C57CDA42"/>
+    <w:lvl w:ilvl="0">
+      <w:start w:val="1"/>
+      <w:numFmt w:val="bullet"/>
+      <w:lvlText w:val=""/>
+      <w:lvlJc w:val="left"/>
+      <w:pPr>
+        <w:tabs>
+          <w:tab w:val="num" w:pos="1440"/>
+        </w:tabs>
+        <w:ind w:left="1440" w:hanging="360"/>
+      </w:pPr>
+      <w:rPr>
+        <w:rFonts w:ascii="Symbol" w:hAnsi="Symbol" w:hint="default"/>
+      </w:rPr>
+    </w:lvl>
+  </w:abstractNum>
+  <w:abstractNum w:abstractNumId="6" w15:restartNumberingAfterBreak="0">
+    <w:nsid w:val="FFFFFF82"/>
+    <w:multiLevelType w:val="singleLevel"/>
+    <w:tmpl w:val="D51075CC"/>
+    <w:lvl w:ilvl="0">
+      <w:start w:val="1"/>
+      <w:numFmt w:val="bullet"/>
+      <w:lvlText w:val=""/>
+      <w:lvlJc w:val="left"/>
+      <w:pPr>
+        <w:tabs>
+          <w:tab w:val="num" w:pos="1080"/>
+        </w:tabs>
+        <w:ind w:left="1080" w:hanging="360"/>
+      </w:pPr>
+      <w:rPr>
+        <w:rFonts w:ascii="Symbol" w:hAnsi="Symbol" w:hint="default"/>
+      </w:rPr>
+    </w:lvl>
+  </w:abstractNum>
+  <w:abstractNum w:abstractNumId="7" w15:restartNumberingAfterBreak="0">
+    <w:nsid w:val="FFFFFF83"/>
+    <w:multiLevelType w:val="singleLevel"/>
+    <w:tmpl w:val="AD3C4230"/>
+    <w:lvl w:ilvl="0">
+      <w:start w:val="1"/>
+      <w:numFmt w:val="bullet"/>
+      <w:lvlText w:val=""/>
+      <w:lvlJc w:val="left"/>
+      <w:pPr>
+        <w:tabs>
+          <w:tab w:val="num" w:pos="720"/>
+        </w:tabs>
+        <w:ind w:left="720" w:hanging="360"/>
+      </w:pPr>
+      <w:rPr>
+        <w:rFonts w:ascii="Symbol" w:hAnsi="Symbol" w:hint="default"/>
+      </w:rPr>
+    </w:lvl>
+  </w:abstractNum>
+  <w:abstractNum w:abstractNumId="8" w15:restartNumberingAfterBreak="0">
+    <w:nsid w:val="FFFFFF88"/>
+    <w:multiLevelType w:val="singleLevel"/>
+    <w:tmpl w:val="94D8A878"/>
+    <w:lvl w:ilvl="0">
+      <w:start w:val="1"/>
+      <w:numFmt w:val="decimal"/>
+      <w:lvlText w:val="%1."/>
+      <w:lvlJc w:val="left"/>
+      <w:pPr>
+        <w:tabs>
+          <w:tab w:val="num" w:pos="360"/>
+        </w:tabs>
+        <w:ind w:left="360" w:hanging="360"/>
+      </w:pPr>
+    </w:lvl>
+  </w:abstractNum>
+  <w:abstractNum w:abstractNumId="9" w15:restartNumberingAfterBreak="0">
+    <w:nsid w:val="FFFFFF89"/>
+    <w:multiLevelType w:val="singleLevel"/>
+    <w:tmpl w:val="13E23D9A"/>
+    <w:lvl w:ilvl="0">
+      <w:start w:val="1"/>
+      <w:numFmt w:val="bullet"/>
+      <w:lvlText w:val=""/>
+      <w:lvlJc w:val="left"/>
+      <w:pPr>
+        <w:tabs>
+          <w:tab w:val="num" w:pos="360"/>
+        </w:tabs>
+        <w:ind w:left="360" w:hanging="360"/>
+      </w:pPr>
+      <w:rPr>
+        <w:rFonts w:ascii="Symbol" w:hAnsi="Symbol" w:hint="default"/>
+      </w:rPr>
+    </w:lvl>
+  </w:abstractNum>
+  <w:abstractNum w:abstractNumId="10" w15:restartNumberingAfterBreak="0">
     <w:nsid w:val="170CD2DE"/>
     <w:multiLevelType w:val="multilevel"/>
     <w:tmpl w:val="386CE8A4"/>
@@ -251,6 +416,36 @@
     </w:lvl>
   </w:abstractNum>
   <w:num w:numId="1">
+    <w:abstractNumId w:val="10"/>
+  </w:num>
+  <w:num w:numId="2">
+    <w:abstractNumId w:val="9"/>
+  </w:num>
+  <w:num w:numId="3">
+    <w:abstractNumId w:val="7"/>
+  </w:num>
+  <w:num w:numId="4">
+    <w:abstractNumId w:val="6"/>
+  </w:num>
+  <w:num w:numId="5">
+    <w:abstractNumId w:val="5"/>
+  </w:num>
+  <w:num w:numId="6">
+    <w:abstractNumId w:val="4"/>
+  </w:num>
+  <w:num w:numId="7">
+    <w:abstractNumId w:val="8"/>
+  </w:num>
+  <w:num w:numId="8">
+    <w:abstractNumId w:val="3"/>
+  </w:num>
+  <w:num w:numId="9">
+    <w:abstractNumId w:val="2"/>
+  </w:num>
+  <w:num w:numId="10">
+    <w:abstractNumId w:val="1"/>
+  </w:num>
+  <w:num w:numId="11">
     <w:abstractNumId w:val="0"/>
   </w:num>
 </w:numbering>
@@ -629,17 +824,17 @@
     <w:link w:val="Heading1Char"/>
     <w:uiPriority w:val="9"/>
     <w:qFormat/>
-    <w:rsid w:val="00A10FD9"/>
+    <w:rsid w:val="00CC5403"/>
     <w:pPr>
       <w:keepNext/>
       <w:keepLines/>
-      <w:spacing w:before="360" w:after="120"/>
+      <w:spacing w:before="360"/>
       <w:outlineLvl w:val="0"/>
     </w:pPr>
     <w:rPr>
-      <w:rFonts w:eastAsiaTheme="majorEastAsia" w:ascii="Arial" w:hAnsi="Arial"/>
+      <w:rFonts w:ascii="Calibri Light" w:eastAsiaTheme="majorEastAsia" w:hAnsi="Calibri Light"/>
       <w:b/>
-      <w:color w:val="1F3864"/>
+      <w:color w:val="C00000"/>
       <w:sz w:val="40"/>
       <w:szCs w:val="40"/>
     </w:rPr>
@@ -661,7 +856,7 @@
       <w:outlineLvl w:val="1"/>
     </w:pPr>
     <w:rPr>
-      <w:rFonts w:eastAsiaTheme="majorEastAsia" w:ascii="Arial" w:hAnsi="Arial"/>
+      <w:rFonts w:eastAsiaTheme="majorEastAsia"/>
       <w:b/>
       <w:color w:val="1F3864"/>
       <w:sz w:val="28"/>
@@ -685,7 +880,7 @@
       <w:outlineLvl w:val="2"/>
     </w:pPr>
     <w:rPr>
-      <w:rFonts w:eastAsiaTheme="majorEastAsia" w:ascii="Arial" w:hAnsi="Arial"/>
+      <w:rFonts w:eastAsiaTheme="majorEastAsia"/>
       <w:b/>
       <w:color w:val="1F3864"/>
       <w:sz w:val="23"/>
@@ -709,7 +904,7 @@
       <w:outlineLvl w:val="3"/>
     </w:pPr>
     <w:rPr>
-      <w:rFonts w:eastAsiaTheme="majorEastAsia" w:ascii="Arial" w:hAnsi="Arial"/>
+      <w:rFonts w:eastAsiaTheme="majorEastAsia"/>
       <w:b/>
       <w:i/>
       <w:iCs/>
@@ -854,6 +1049,7 @@
   <w:style w:type="paragraph" w:styleId="BodyText">
     <w:name w:val="Body Text"/>
     <w:basedOn w:val="Normal"/>
+    <w:link w:val="BodyTextChar"/>
     <w:qFormat/>
     <w:pPr>
       <w:spacing w:before="180" w:after="180"/>
@@ -1005,11 +1201,11 @@
     <w:basedOn w:val="DefaultParagraphFont"/>
     <w:link w:val="Heading1"/>
     <w:uiPriority w:val="9"/>
-    <w:rsid w:val="00A10FD9"/>
-    <w:rPr>
-      <w:rFonts w:ascii="Arial" w:eastAsiaTheme="majorEastAsia" w:hAnsi="Arial" w:cs="Arial"/>
+    <w:rsid w:val="00CC5403"/>
+    <w:rPr>
+      <w:rFonts w:ascii="Calibri Light" w:eastAsiaTheme="majorEastAsia" w:hAnsi="Calibri Light" w:cs="Arial"/>
       <w:b/>
-      <w:color w:val="1F3864"/>
+      <w:color w:val="C00000"/>
       <w:sz w:val="40"/>
       <w:szCs w:val="40"/>
     </w:rPr>
@@ -1198,9 +1394,6 @@
     <w:name w:val="caption"/>
     <w:basedOn w:val="Normal"/>
     <w:link w:val="CaptionChar"/>
-    <w:pPr>
-      <w:spacing w:after="120"/>
-    </w:pPr>
     <w:rPr>
       <w:i/>
     </w:rPr>
@@ -1341,10 +1534,6 @@
   <w:style w:type="paragraph" w:customStyle="1" w:styleId="GuidanceText">
     <w:name w:val="Guidance Text"/>
     <w:basedOn w:val="Normal"/>
-    <w:rPr>
-      <w:rFonts w:ascii="Arial" w:hAnsi="Arial"/>
-      <w:sz w:val="20"/>
-    </w:rPr>
   </w:style>
   <w:style w:type="table" w:customStyle="1" w:styleId="CalloutGuidance">
     <w:name w:val="Callout Guidance"/>
@@ -1355,32 +1544,24 @@
     </w:rPr>
     <w:tblPr>
       <w:tblBorders>
-        <w:top w:val="single" w:sz="6" w:color="5B9BD5"/>
-        <w:left w:val="single" w:sz="6" w:color="5B9BD5"/>
-        <w:bottom w:val="single" w:sz="6" w:color="5B9BD5"/>
-        <w:right w:val="single" w:sz="6" w:color="5B9BD5"/>
-        <w:insideH w:val="single" w:sz="6" w:color="5B9BD5"/>
-        <w:insideV w:val="single" w:sz="6" w:color="5B9BD5"/>
+        <w:top w:val="single" w:sz="6" w:space="0" w:color="5B9BD5"/>
+        <w:left w:val="single" w:sz="6" w:space="0" w:color="5B9BD5"/>
+        <w:bottom w:val="single" w:sz="6" w:space="0" w:color="5B9BD5"/>
+        <w:right w:val="single" w:sz="6" w:space="0" w:color="5B9BD5"/>
+        <w:insideH w:val="single" w:sz="6" w:space="0" w:color="5B9BD5"/>
+        <w:insideV w:val="single" w:sz="6" w:space="0" w:color="5B9BD5"/>
       </w:tblBorders>
     </w:tblPr>
-    <w:tblStylePr w:type="wholeTable">
+    <w:tblStylePr w:type="firstRow">
+      <w:tblPr/>
       <w:tcPr>
-        <w:shd w:fill="DBEAF7"/>
+        <w:shd w:val="clear" w:color="auto" w:fill="DBEAF7"/>
       </w:tcPr>
     </w:tblStylePr>
-    <w:tblStylePr w:type="firstRow">
-      <w:tcPr>
-        <w:shd w:fill="DBEAF7"/>
-      </w:tcPr>
-    </w:tblStylePr>
   </w:style>
   <w:style w:type="paragraph" w:customStyle="1" w:styleId="ExampleText">
     <w:name w:val="Example Text"/>
     <w:basedOn w:val="Normal"/>
-    <w:rPr>
-      <w:rFonts w:ascii="Arial" w:hAnsi="Arial"/>
-      <w:sz w:val="20"/>
-    </w:rPr>
   </w:style>
   <w:style w:type="table" w:customStyle="1" w:styleId="CalloutExample">
     <w:name w:val="Callout Example"/>
@@ -1391,32 +1572,24 @@
     </w:rPr>
     <w:tblPr>
       <w:tblBorders>
-        <w:top w:val="single" w:sz="6" w:color="70AD47"/>
-        <w:left w:val="single" w:sz="6" w:color="70AD47"/>
-        <w:bottom w:val="single" w:sz="6" w:color="70AD47"/>
-        <w:right w:val="single" w:sz="6" w:color="70AD47"/>
-        <w:insideH w:val="single" w:sz="6" w:color="70AD47"/>
-        <w:insideV w:val="single" w:sz="6" w:color="70AD47"/>
+        <w:top w:val="single" w:sz="6" w:space="0" w:color="70AD47"/>
+        <w:left w:val="single" w:sz="6" w:space="0" w:color="70AD47"/>
+        <w:bottom w:val="single" w:sz="6" w:space="0" w:color="70AD47"/>
+        <w:right w:val="single" w:sz="6" w:space="0" w:color="70AD47"/>
+        <w:insideH w:val="single" w:sz="6" w:space="0" w:color="70AD47"/>
+        <w:insideV w:val="single" w:sz="6" w:space="0" w:color="70AD47"/>
       </w:tblBorders>
     </w:tblPr>
-    <w:tblStylePr w:type="wholeTable">
+    <w:tblStylePr w:type="firstRow">
+      <w:tblPr/>
       <w:tcPr>
-        <w:shd w:fill="E2F0D9"/>
+        <w:shd w:val="clear" w:color="auto" w:fill="E2F0D9"/>
       </w:tcPr>
     </w:tblStylePr>
-    <w:tblStylePr w:type="firstRow">
-      <w:tcPr>
-        <w:shd w:fill="E2F0D9"/>
-      </w:tcPr>
-    </w:tblStylePr>
   </w:style>
   <w:style w:type="paragraph" w:customStyle="1" w:styleId="DiagramText">
     <w:name w:val="Diagram Text"/>
     <w:basedOn w:val="Normal"/>
-    <w:rPr>
-      <w:rFonts w:ascii="Arial" w:hAnsi="Arial"/>
-      <w:sz w:val="20"/>
-    </w:rPr>
   </w:style>
   <w:style w:type="table" w:customStyle="1" w:styleId="CalloutDiagram">
     <w:name w:val="Callout Diagram"/>
@@ -1427,32 +1600,24 @@
     </w:rPr>
     <w:tblPr>
       <w:tblBorders>
-        <w:top w:val="single" w:sz="6" w:color="8064A2"/>
-        <w:left w:val="single" w:sz="6" w:color="8064A2"/>
-        <w:bottom w:val="single" w:sz="6" w:color="8064A2"/>
-        <w:right w:val="single" w:sz="6" w:color="8064A2"/>
-        <w:insideH w:val="single" w:sz="6" w:color="8064A2"/>
-        <w:insideV w:val="single" w:sz="6" w:color="8064A2"/>
+        <w:top w:val="single" w:sz="6" w:space="0" w:color="8064A2"/>
+        <w:left w:val="single" w:sz="6" w:space="0" w:color="8064A2"/>
+        <w:bottom w:val="single" w:sz="6" w:space="0" w:color="8064A2"/>
+        <w:right w:val="single" w:sz="6" w:space="0" w:color="8064A2"/>
+        <w:insideH w:val="single" w:sz="6" w:space="0" w:color="8064A2"/>
+        <w:insideV w:val="single" w:sz="6" w:space="0" w:color="8064A2"/>
       </w:tblBorders>
     </w:tblPr>
-    <w:tblStylePr w:type="wholeTable">
+    <w:tblStylePr w:type="firstRow">
+      <w:tblPr/>
       <w:tcPr>
-        <w:shd w:fill="E4DFEC"/>
+        <w:shd w:val="clear" w:color="auto" w:fill="E4DFEC"/>
       </w:tcPr>
     </w:tblStylePr>
-    <w:tblStylePr w:type="firstRow">
-      <w:tcPr>
-        <w:shd w:fill="E4DFEC"/>
-      </w:tcPr>
-    </w:tblStylePr>
   </w:style>
   <w:style w:type="paragraph" w:customStyle="1" w:styleId="ReferenceText">
     <w:name w:val="Reference Text"/>
     <w:basedOn w:val="Normal"/>
-    <w:rPr>
-      <w:rFonts w:ascii="Arial" w:hAnsi="Arial"/>
-      <w:sz w:val="20"/>
-    </w:rPr>
   </w:style>
   <w:style w:type="table" w:customStyle="1" w:styleId="CalloutReference">
     <w:name w:val="Callout Reference"/>
@@ -1463,32 +1628,24 @@
     </w:rPr>
     <w:tblPr>
       <w:tblBorders>
-        <w:top w:val="single" w:sz="6" w:color="7F7F7F"/>
-        <w:left w:val="single" w:sz="6" w:color="7F7F7F"/>
-        <w:bottom w:val="single" w:sz="6" w:color="7F7F7F"/>
-        <w:right w:val="single" w:sz="6" w:color="7F7F7F"/>
-        <w:insideH w:val="single" w:sz="6" w:color="7F7F7F"/>
-        <w:insideV w:val="single" w:sz="6" w:color="7F7F7F"/>
+        <w:top w:val="single" w:sz="6" w:space="0" w:color="7F7F7F"/>
+        <w:left w:val="single" w:sz="6" w:space="0" w:color="7F7F7F"/>
+        <w:bottom w:val="single" w:sz="6" w:space="0" w:color="7F7F7F"/>
+        <w:right w:val="single" w:sz="6" w:space="0" w:color="7F7F7F"/>
+        <w:insideH w:val="single" w:sz="6" w:space="0" w:color="7F7F7F"/>
+        <w:insideV w:val="single" w:sz="6" w:space="0" w:color="7F7F7F"/>
       </w:tblBorders>
     </w:tblPr>
-    <w:tblStylePr w:type="wholeTable">
+    <w:tblStylePr w:type="firstRow">
+      <w:tblPr/>
       <w:tcPr>
-        <w:shd w:fill="E7E6E6"/>
+        <w:shd w:val="clear" w:color="auto" w:fill="E7E6E6"/>
       </w:tcPr>
     </w:tblStylePr>
-    <w:tblStylePr w:type="firstRow">
-      <w:tcPr>
-        <w:shd w:fill="E7E6E6"/>
-      </w:tcPr>
-    </w:tblStylePr>
   </w:style>
   <w:style w:type="paragraph" w:customStyle="1" w:styleId="RequiredText">
     <w:name w:val="Required Text"/>
     <w:basedOn w:val="Normal"/>
-    <w:rPr>
-      <w:rFonts w:ascii="Arial" w:hAnsi="Arial"/>
-      <w:sz w:val="20"/>
-    </w:rPr>
   </w:style>
   <w:style w:type="table" w:customStyle="1" w:styleId="CalloutRequired">
     <w:name w:val="Callout Required"/>
@@ -1499,32 +1656,24 @@
     </w:rPr>
     <w:tblPr>
       <w:tblBorders>
-        <w:top w:val="single" w:sz="6" w:color="C00000"/>
-        <w:left w:val="single" w:sz="6" w:color="C00000"/>
-        <w:bottom w:val="single" w:sz="6" w:color="C00000"/>
-        <w:right w:val="single" w:sz="6" w:color="C00000"/>
-        <w:insideH w:val="single" w:sz="6" w:color="C00000"/>
-        <w:insideV w:val="single" w:sz="6" w:color="C00000"/>
+        <w:top w:val="single" w:sz="6" w:space="0" w:color="C00000"/>
+        <w:left w:val="single" w:sz="6" w:space="0" w:color="C00000"/>
+        <w:bottom w:val="single" w:sz="6" w:space="0" w:color="C00000"/>
+        <w:right w:val="single" w:sz="6" w:space="0" w:color="C00000"/>
+        <w:insideH w:val="single" w:sz="6" w:space="0" w:color="C00000"/>
+        <w:insideV w:val="single" w:sz="6" w:space="0" w:color="C00000"/>
       </w:tblBorders>
     </w:tblPr>
-    <w:tblStylePr w:type="wholeTable">
+    <w:tblStylePr w:type="firstRow">
+      <w:tblPr/>
       <w:tcPr>
-        <w:shd w:fill="FCE4D6"/>
+        <w:shd w:val="clear" w:color="auto" w:fill="FCE4D6"/>
       </w:tcPr>
     </w:tblStylePr>
-    <w:tblStylePr w:type="firstRow">
-      <w:tcPr>
-        <w:shd w:fill="FCE4D6"/>
-      </w:tcPr>
-    </w:tblStylePr>
   </w:style>
   <w:style w:type="paragraph" w:customStyle="1" w:styleId="CautionText">
     <w:name w:val="Caution Text"/>
     <w:basedOn w:val="Normal"/>
-    <w:rPr>
-      <w:rFonts w:ascii="Arial" w:hAnsi="Arial"/>
-      <w:sz w:val="20"/>
-    </w:rPr>
   </w:style>
   <w:style w:type="table" w:customStyle="1" w:styleId="CalloutCaution">
     <w:name w:val="Callout Caution"/>
@@ -1535,22 +1684,18 @@
     </w:rPr>
     <w:tblPr>
       <w:tblBorders>
-        <w:top w:val="single" w:sz="6" w:color="BF9000"/>
-        <w:left w:val="single" w:sz="6" w:color="BF9000"/>
-        <w:bottom w:val="single" w:sz="6" w:color="BF9000"/>
-        <w:right w:val="single" w:sz="6" w:color="BF9000"/>
-        <w:insideH w:val="single" w:sz="6" w:color="BF9000"/>
-        <w:insideV w:val="single" w:sz="6" w:color="BF9000"/>
+        <w:top w:val="single" w:sz="6" w:space="0" w:color="BF9000"/>
+        <w:left w:val="single" w:sz="6" w:space="0" w:color="BF9000"/>
+        <w:bottom w:val="single" w:sz="6" w:space="0" w:color="BF9000"/>
+        <w:right w:val="single" w:sz="6" w:space="0" w:color="BF9000"/>
+        <w:insideH w:val="single" w:sz="6" w:space="0" w:color="BF9000"/>
+        <w:insideV w:val="single" w:sz="6" w:space="0" w:color="BF9000"/>
       </w:tblBorders>
     </w:tblPr>
-    <w:tblStylePr w:type="wholeTable">
+    <w:tblStylePr w:type="firstRow">
+      <w:tblPr/>
       <w:tcPr>
-        <w:shd w:fill="FFF2CC"/>
-      </w:tcPr>
-    </w:tblStylePr>
-    <w:tblStylePr w:type="firstRow">
-      <w:tcPr>
-        <w:shd w:fill="FFF2CC"/>
+        <w:shd w:val="clear" w:color="auto" w:fill="FFF2CC"/>
       </w:tcPr>
     </w:tblStylePr>
   </w:style>
@@ -1563,22 +1708,18 @@
     </w:rPr>
     <w:tblPr>
       <w:tblBorders>
-        <w:top w:val="single" w:sz="6" w:color="7F7F7F"/>
-        <w:left w:val="single" w:sz="6" w:color="7F7F7F"/>
-        <w:bottom w:val="single" w:sz="6" w:color="7F7F7F"/>
-        <w:right w:val="single" w:sz="6" w:color="7F7F7F"/>
-        <w:insideH w:val="single" w:sz="6" w:color="7F7F7F"/>
-        <w:insideV w:val="single" w:sz="6" w:color="7F7F7F"/>
+        <w:top w:val="single" w:sz="6" w:space="0" w:color="7F7F7F"/>
+        <w:left w:val="single" w:sz="6" w:space="0" w:color="7F7F7F"/>
+        <w:bottom w:val="single" w:sz="6" w:space="0" w:color="7F7F7F"/>
+        <w:right w:val="single" w:sz="6" w:space="0" w:color="7F7F7F"/>
+        <w:insideH w:val="single" w:sz="6" w:space="0" w:color="7F7F7F"/>
+        <w:insideV w:val="single" w:sz="6" w:space="0" w:color="7F7F7F"/>
       </w:tblBorders>
     </w:tblPr>
-    <w:tblStylePr w:type="wholeTable">
+    <w:tblStylePr w:type="firstRow">
+      <w:tblPr/>
       <w:tcPr>
-        <w:shd w:fill="FFFFFF"/>
-      </w:tcPr>
-    </w:tblStylePr>
-    <w:tblStylePr w:type="firstRow">
-      <w:tcPr>
-        <w:shd w:fill="D9E2F3"/>
+        <w:shd w:val="clear" w:color="auto" w:fill="D9E2F3"/>
       </w:tcPr>
     </w:tblStylePr>
   </w:style>
@@ -1591,22 +1732,18 @@
     </w:rPr>
     <w:tblPr>
       <w:tblBorders>
-        <w:top w:val="single" w:sz="6" w:color="5B9BD5"/>
-        <w:left w:val="single" w:sz="6" w:color="5B9BD5"/>
-        <w:bottom w:val="single" w:sz="6" w:color="5B9BD5"/>
-        <w:right w:val="single" w:sz="6" w:color="5B9BD5"/>
-        <w:insideH w:val="single" w:sz="6" w:color="5B9BD5"/>
-        <w:insideV w:val="single" w:sz="6" w:color="5B9BD5"/>
+        <w:top w:val="single" w:sz="6" w:space="0" w:color="5B9BD5"/>
+        <w:left w:val="single" w:sz="6" w:space="0" w:color="5B9BD5"/>
+        <w:bottom w:val="single" w:sz="6" w:space="0" w:color="5B9BD5"/>
+        <w:right w:val="single" w:sz="6" w:space="0" w:color="5B9BD5"/>
+        <w:insideH w:val="single" w:sz="6" w:space="0" w:color="5B9BD5"/>
+        <w:insideV w:val="single" w:sz="6" w:space="0" w:color="5B9BD5"/>
       </w:tblBorders>
     </w:tblPr>
-    <w:tblStylePr w:type="wholeTable">
+    <w:tblStylePr w:type="firstRow">
+      <w:tblPr/>
       <w:tcPr>
-        <w:shd w:fill="FFFFFF"/>
-      </w:tcPr>
-    </w:tblStylePr>
-    <w:tblStylePr w:type="firstRow">
-      <w:tcPr>
-        <w:shd w:fill="D9E2F3"/>
+        <w:shd w:val="clear" w:color="auto" w:fill="D9E2F3"/>
       </w:tcPr>
     </w:tblStylePr>
   </w:style>
@@ -1619,22 +1756,18 @@
     </w:rPr>
     <w:tblPr>
       <w:tblBorders>
-        <w:top w:val="single" w:sz="6" w:color="5B9BD5"/>
-        <w:left w:val="single" w:sz="6" w:color="5B9BD5"/>
-        <w:bottom w:val="single" w:sz="6" w:color="5B9BD5"/>
-        <w:right w:val="single" w:sz="6" w:color="5B9BD5"/>
-        <w:insideH w:val="single" w:sz="6" w:color="5B9BD5"/>
-        <w:insideV w:val="single" w:sz="6" w:color="5B9BD5"/>
+        <w:top w:val="single" w:sz="6" w:space="0" w:color="5B9BD5"/>
+        <w:left w:val="single" w:sz="6" w:space="0" w:color="5B9BD5"/>
+        <w:bottom w:val="single" w:sz="6" w:space="0" w:color="5B9BD5"/>
+        <w:right w:val="single" w:sz="6" w:space="0" w:color="5B9BD5"/>
+        <w:insideH w:val="single" w:sz="6" w:space="0" w:color="5B9BD5"/>
+        <w:insideV w:val="single" w:sz="6" w:space="0" w:color="5B9BD5"/>
       </w:tblBorders>
     </w:tblPr>
-    <w:tblStylePr w:type="wholeTable">
+    <w:tblStylePr w:type="firstRow">
+      <w:tblPr/>
       <w:tcPr>
-        <w:shd w:fill="FFFFFF"/>
-      </w:tcPr>
-    </w:tblStylePr>
-    <w:tblStylePr w:type="firstRow">
-      <w:tcPr>
-        <w:shd w:fill="D9E2F3"/>
+        <w:shd w:val="clear" w:color="auto" w:fill="D9E2F3"/>
       </w:tcPr>
     </w:tblStylePr>
   </w:style>
@@ -1644,6 +1777,16 @@
       <w:rFonts w:ascii="Arial" w:hAnsi="Arial"/>
       <w:i/>
       <w:color w:val="7F7F7F"/>
+      <w:sz w:val="20"/>
+    </w:rPr>
+  </w:style>
+  <w:style w:type="character" w:customStyle="1" w:styleId="BodyTextChar">
+    <w:name w:val="Body Text Char"/>
+    <w:basedOn w:val="DefaultParagraphFont"/>
+    <w:link w:val="BodyText"/>
+    <w:rsid w:val="00CC5403"/>
+    <w:rPr>
+      <w:rFonts w:ascii="Arial" w:hAnsi="Arial" w:cs="Arial"/>
       <w:sz w:val="20"/>
     </w:rPr>
   </w:style>

</xml_diff>